<commit_message>
Add What just happened coding dimensions
</commit_message>
<xml_diff>
--- a/docs/Dimensions_of_Expression_Taxonomy.docx
+++ b/docs/Dimensions_of_Expression_Taxonomy.docx
@@ -57,10 +57,11 @@
         <w:tblInd w:w="120" w:type="dxa"/>
       </w:tblPr>
       <w:tblGrid>
-        <w:gridCol w:w="2340"/>
-        <w:gridCol w:w="2340"/>
-        <w:gridCol w:w="2340"/>
-        <w:gridCol w:w="2340"/>
+        <w:gridCol w:w="1872"/>
+        <w:gridCol w:w="1872"/>
+        <w:gridCol w:w="1872"/>
+        <w:gridCol w:w="1872"/>
+        <w:gridCol w:w="1872"/>
       </w:tblGrid>
       <w:tr>
         <w:trPr>
@@ -68,7 +69,7 @@
         </w:trPr>
         <w:tc>
           <w:tcPr>
-            <w:tcW w:type="dxa" w:w="2340"/>
+            <w:tcW w:type="dxa" w:w="1872"/>
             <w:shd w:fill="E8EEF5"/>
             <w:tcMar>
               <w:top w:w="80" w:type="dxa"/>
@@ -97,7 +98,7 @@
         </w:tc>
         <w:tc>
           <w:tcPr>
-            <w:tcW w:type="dxa" w:w="2340"/>
+            <w:tcW w:type="dxa" w:w="1872"/>
             <w:shd w:fill="E8EEF5"/>
             <w:tcMar>
               <w:top w:w="80" w:type="dxa"/>
@@ -126,7 +127,7 @@
         </w:tc>
         <w:tc>
           <w:tcPr>
-            <w:tcW w:type="dxa" w:w="2340"/>
+            <w:tcW w:type="dxa" w:w="1872"/>
             <w:shd w:fill="E8EEF5"/>
             <w:tcMar>
               <w:top w:w="80" w:type="dxa"/>
@@ -155,7 +156,36 @@
         </w:tc>
         <w:tc>
           <w:tcPr>
-            <w:tcW w:type="dxa" w:w="2340"/>
+            <w:tcW w:type="dxa" w:w="1872"/>
+            <w:shd w:fill="E8EEF5"/>
+            <w:tcMar>
+              <w:top w:w="80" w:type="dxa"/>
+              <w:start w:w="120" w:type="dxa"/>
+              <w:bottom w:w="80" w:type="dxa"/>
+              <w:end w:w="120" w:type="dxa"/>
+            </w:tcMar>
+            <w:vAlign w:val="center"/>
+          </w:tcPr>
+          <w:p>
+            <w:pPr>
+              <w:spacing w:after="0"/>
+              <w:jc w:val="center"/>
+            </w:pPr>
+            <w:r>
+              <w:rPr>
+                <w:rFonts w:ascii="Calibri" w:hAnsi="Calibri"/>
+                <w:b/>
+                <w:i w:val="0"/>
+                <w:color w:val="1F4D78"/>
+                <w:sz w:val="17"/>
+              </w:rPr>
+              <w:t>Event options</w:t>
+            </w:r>
+          </w:p>
+        </w:tc>
+        <w:tc>
+          <w:tcPr>
+            <w:tcW w:type="dxa" w:w="1872"/>
             <w:shd w:fill="E8EEF5"/>
             <w:tcMar>
               <w:top w:w="80" w:type="dxa"/>
@@ -189,7 +219,7 @@
         </w:trPr>
         <w:tc>
           <w:tcPr>
-            <w:tcW w:type="dxa" w:w="2340"/>
+            <w:tcW w:type="dxa" w:w="1872"/>
             <w:shd w:fill="FFFFFF"/>
             <w:tcMar>
               <w:top w:w="80" w:type="dxa"/>
@@ -218,7 +248,7 @@
         </w:tc>
         <w:tc>
           <w:tcPr>
-            <w:tcW w:type="dxa" w:w="2340"/>
+            <w:tcW w:type="dxa" w:w="1872"/>
             <w:shd w:fill="FFFFFF"/>
             <w:tcMar>
               <w:top w:w="80" w:type="dxa"/>
@@ -247,7 +277,7 @@
         </w:tc>
         <w:tc>
           <w:tcPr>
-            <w:tcW w:type="dxa" w:w="2340"/>
+            <w:tcW w:type="dxa" w:w="1872"/>
             <w:shd w:fill="FFFFFF"/>
             <w:tcMar>
               <w:top w:w="80" w:type="dxa"/>
@@ -276,7 +306,7 @@
         </w:tc>
         <w:tc>
           <w:tcPr>
-            <w:tcW w:type="dxa" w:w="2340"/>
+            <w:tcW w:type="dxa" w:w="1872"/>
             <w:shd w:fill="FFFFFF"/>
             <w:tcMar>
               <w:top w:w="80" w:type="dxa"/>
@@ -299,7 +329,36 @@
                 <w:color w:val="246A73"/>
                 <w:sz w:val="32"/>
               </w:rPr>
-              <w:t>433</w:t>
+              <w:t>76</w:t>
+            </w:r>
+          </w:p>
+        </w:tc>
+        <w:tc>
+          <w:tcPr>
+            <w:tcW w:type="dxa" w:w="1872"/>
+            <w:shd w:fill="FFFFFF"/>
+            <w:tcMar>
+              <w:top w:w="80" w:type="dxa"/>
+              <w:start w:w="120" w:type="dxa"/>
+              <w:bottom w:w="80" w:type="dxa"/>
+              <w:end w:w="120" w:type="dxa"/>
+            </w:tcMar>
+            <w:vAlign w:val="center"/>
+          </w:tcPr>
+          <w:p>
+            <w:pPr>
+              <w:spacing w:after="0"/>
+              <w:jc w:val="center"/>
+            </w:pPr>
+            <w:r>
+              <w:rPr>
+                <w:rFonts w:ascii="Calibri" w:hAnsi="Calibri"/>
+                <w:b/>
+                <w:i w:val="0"/>
+                <w:color w:val="246A73"/>
+                <w:sz w:val="32"/>
+              </w:rPr>
+              <w:t>496</w:t>
             </w:r>
           </w:p>
         </w:tc>
@@ -2983,7 +3042,656 @@
         <w:keepNext/>
       </w:pPr>
       <w:r>
-        <w:t>3. Vocabulary Assignment Taxonomy</w:t>
+        <w:t>3. What Just Happened</w:t>
+      </w:r>
+    </w:p>
+    <w:p>
+      <w:pPr>
+        <w:spacing w:after="160"/>
+      </w:pPr>
+      <w:r>
+        <w:t>Each dimension uses a selectable interpretation label and a 0 to 100 intensity slider to code the inferred change process.</w:t>
+      </w:r>
+    </w:p>
+    <w:tbl>
+      <w:tblPr>
+        <w:tblStyle w:val="TableGrid"/>
+        <w:tblW w:type="dxa" w:w="9360"/>
+        <w:jc w:val="left"/>
+        <w:tblLayout w:type="fixed"/>
+        <w:tblLook w:firstColumn="1" w:firstRow="1" w:lastColumn="0" w:lastRow="0" w:noHBand="0" w:noVBand="1" w:val="04A0"/>
+        <w:tblInd w:w="120" w:type="dxa"/>
+      </w:tblPr>
+      <w:tblGrid>
+        <w:gridCol w:w="1800"/>
+        <w:gridCol w:w="7020"/>
+        <w:gridCol w:w="540"/>
+      </w:tblGrid>
+      <w:tr>
+        <w:trPr>
+          <w:tblHeader w:val="true"/>
+        </w:trPr>
+        <w:tc>
+          <w:tcPr>
+            <w:tcW w:type="dxa" w:w="1800"/>
+            <w:shd w:fill="E8EEF5"/>
+            <w:tcMar>
+              <w:top w:w="80" w:type="dxa"/>
+              <w:start w:w="120" w:type="dxa"/>
+              <w:bottom w:w="80" w:type="dxa"/>
+              <w:end w:w="120" w:type="dxa"/>
+            </w:tcMar>
+            <w:vAlign w:val="center"/>
+          </w:tcPr>
+          <w:p>
+            <w:pPr>
+              <w:spacing w:after="0"/>
+            </w:pPr>
+            <w:r>
+              <w:rPr>
+                <w:rFonts w:ascii="Calibri" w:hAnsi="Calibri"/>
+                <w:b/>
+                <w:i w:val="0"/>
+                <w:color w:val="1F4D78"/>
+                <w:sz w:val="19"/>
+              </w:rPr>
+              <w:t>Dimension</w:t>
+            </w:r>
+          </w:p>
+        </w:tc>
+        <w:tc>
+          <w:tcPr>
+            <w:tcW w:type="dxa" w:w="7020"/>
+            <w:shd w:fill="E8EEF5"/>
+            <w:tcMar>
+              <w:top w:w="80" w:type="dxa"/>
+              <w:start w:w="120" w:type="dxa"/>
+              <w:bottom w:w="80" w:type="dxa"/>
+              <w:end w:w="120" w:type="dxa"/>
+            </w:tcMar>
+            <w:vAlign w:val="center"/>
+          </w:tcPr>
+          <w:p>
+            <w:pPr>
+              <w:spacing w:after="0"/>
+            </w:pPr>
+            <w:r>
+              <w:rPr>
+                <w:rFonts w:ascii="Calibri" w:hAnsi="Calibri"/>
+                <w:b/>
+                <w:i w:val="0"/>
+                <w:color w:val="1F4D78"/>
+                <w:sz w:val="19"/>
+              </w:rPr>
+              <w:t>Tags</w:t>
+            </w:r>
+          </w:p>
+        </w:tc>
+        <w:tc>
+          <w:tcPr>
+            <w:tcW w:type="dxa" w:w="540"/>
+            <w:shd w:fill="E8EEF5"/>
+            <w:tcMar>
+              <w:top w:w="80" w:type="dxa"/>
+              <w:start w:w="120" w:type="dxa"/>
+              <w:bottom w:w="80" w:type="dxa"/>
+              <w:end w:w="120" w:type="dxa"/>
+            </w:tcMar>
+            <w:vAlign w:val="center"/>
+          </w:tcPr>
+          <w:p>
+            <w:pPr>
+              <w:spacing w:after="0"/>
+              <w:jc w:val="center"/>
+            </w:pPr>
+            <w:r>
+              <w:rPr>
+                <w:rFonts w:ascii="Calibri" w:hAnsi="Calibri"/>
+                <w:b/>
+                <w:i w:val="0"/>
+                <w:color w:val="1F4D78"/>
+                <w:sz w:val="19"/>
+              </w:rPr>
+              <w:t>Count</w:t>
+            </w:r>
+          </w:p>
+        </w:tc>
+      </w:tr>
+      <w:tr>
+        <w:trPr>
+          <w:cantSplit/>
+        </w:trPr>
+        <w:tc>
+          <w:tcPr>
+            <w:tcW w:type="dxa" w:w="1800"/>
+            <w:tcMar>
+              <w:top w:w="80" w:type="dxa"/>
+              <w:start w:w="120" w:type="dxa"/>
+              <w:bottom w:w="80" w:type="dxa"/>
+              <w:end w:w="120" w:type="dxa"/>
+            </w:tcMar>
+            <w:vAlign w:val="center"/>
+          </w:tcPr>
+          <w:p>
+            <w:pPr>
+              <w:spacing w:after="0"/>
+            </w:pPr>
+            <w:r>
+              <w:rPr>
+                <w:rFonts w:ascii="Calibri" w:hAnsi="Calibri"/>
+                <w:b/>
+                <w:i w:val="0"/>
+                <w:color w:val="202124"/>
+                <w:sz w:val="19"/>
+              </w:rPr>
+              <w:t>What changed? (default: new possibility opened)</w:t>
+            </w:r>
+          </w:p>
+        </w:tc>
+        <w:tc>
+          <w:tcPr>
+            <w:tcW w:type="dxa" w:w="7020"/>
+            <w:tcMar>
+              <w:top w:w="80" w:type="dxa"/>
+              <w:start w:w="120" w:type="dxa"/>
+              <w:bottom w:w="80" w:type="dxa"/>
+              <w:end w:w="120" w:type="dxa"/>
+            </w:tcMar>
+            <w:vAlign w:val="center"/>
+          </w:tcPr>
+          <w:p>
+            <w:pPr>
+              <w:spacing w:after="0"/>
+            </w:pPr>
+            <w:r>
+              <w:rPr>
+                <w:rFonts w:ascii="Calibri" w:hAnsi="Calibri"/>
+                <w:b w:val="0"/>
+                <w:i w:val="0"/>
+                <w:color w:val="202124"/>
+                <w:sz w:val="19"/>
+              </w:rPr>
+              <w:t>new possibility opened, belief overturned, hidden information surfaced, choice narrowed, choice expanded, identity or status shifted, expectation failed, threat appeared, harm witnessed, internalizing loss, betrayal or boundary violation, connection strengthened</w:t>
+            </w:r>
+          </w:p>
+        </w:tc>
+        <w:tc>
+          <w:tcPr>
+            <w:tcW w:type="dxa" w:w="540"/>
+            <w:tcMar>
+              <w:top w:w="80" w:type="dxa"/>
+              <w:start w:w="120" w:type="dxa"/>
+              <w:bottom w:w="80" w:type="dxa"/>
+              <w:end w:w="120" w:type="dxa"/>
+            </w:tcMar>
+            <w:vAlign w:val="center"/>
+          </w:tcPr>
+          <w:p>
+            <w:pPr>
+              <w:spacing w:after="0"/>
+              <w:jc w:val="center"/>
+            </w:pPr>
+            <w:r>
+              <w:rPr>
+                <w:rFonts w:ascii="Calibri" w:hAnsi="Calibri"/>
+                <w:b/>
+                <w:i w:val="0"/>
+                <w:color w:val="657078"/>
+                <w:sz w:val="19"/>
+              </w:rPr>
+              <w:t>12</w:t>
+            </w:r>
+          </w:p>
+        </w:tc>
+      </w:tr>
+      <w:tr>
+        <w:trPr>
+          <w:cantSplit/>
+        </w:trPr>
+        <w:tc>
+          <w:tcPr>
+            <w:tcW w:type="dxa" w:w="1800"/>
+            <w:tcMar>
+              <w:top w:w="80" w:type="dxa"/>
+              <w:start w:w="120" w:type="dxa"/>
+              <w:bottom w:w="80" w:type="dxa"/>
+              <w:end w:w="120" w:type="dxa"/>
+            </w:tcMar>
+            <w:vAlign w:val="center"/>
+          </w:tcPr>
+          <w:p>
+            <w:pPr>
+              <w:spacing w:after="0"/>
+            </w:pPr>
+            <w:r>
+              <w:rPr>
+                <w:rFonts w:ascii="Calibri" w:hAnsi="Calibri"/>
+                <w:b/>
+                <w:i w:val="0"/>
+                <w:color w:val="202124"/>
+                <w:sz w:val="19"/>
+              </w:rPr>
+              <w:t>Emotional leakage (default: mixed signal)</w:t>
+            </w:r>
+          </w:p>
+        </w:tc>
+        <w:tc>
+          <w:tcPr>
+            <w:tcW w:type="dxa" w:w="7020"/>
+            <w:tcMar>
+              <w:top w:w="80" w:type="dxa"/>
+              <w:start w:w="120" w:type="dxa"/>
+              <w:bottom w:w="80" w:type="dxa"/>
+              <w:end w:w="120" w:type="dxa"/>
+            </w:tcMar>
+            <w:vAlign w:val="center"/>
+          </w:tcPr>
+          <w:p>
+            <w:pPr>
+              <w:spacing w:after="0"/>
+            </w:pPr>
+            <w:r>
+              <w:rPr>
+                <w:rFonts w:ascii="Calibri" w:hAnsi="Calibri"/>
+                <w:b w:val="0"/>
+                <w:i w:val="0"/>
+                <w:color w:val="202124"/>
+                <w:sz w:val="19"/>
+              </w:rPr>
+              <w:t>fully masked, controlled surface, faint leakage, mixed signal, visible strain, emotion breaking through, involuntary flash, delayed reaction, overcorrection, openly expressed, emotion flooding, mask collapsing</w:t>
+            </w:r>
+          </w:p>
+        </w:tc>
+        <w:tc>
+          <w:tcPr>
+            <w:tcW w:type="dxa" w:w="540"/>
+            <w:tcMar>
+              <w:top w:w="80" w:type="dxa"/>
+              <w:start w:w="120" w:type="dxa"/>
+              <w:bottom w:w="80" w:type="dxa"/>
+              <w:end w:w="120" w:type="dxa"/>
+            </w:tcMar>
+            <w:vAlign w:val="center"/>
+          </w:tcPr>
+          <w:p>
+            <w:pPr>
+              <w:spacing w:after="0"/>
+              <w:jc w:val="center"/>
+            </w:pPr>
+            <w:r>
+              <w:rPr>
+                <w:rFonts w:ascii="Calibri" w:hAnsi="Calibri"/>
+                <w:b/>
+                <w:i w:val="0"/>
+                <w:color w:val="657078"/>
+                <w:sz w:val="19"/>
+              </w:rPr>
+              <w:t>12</w:t>
+            </w:r>
+          </w:p>
+        </w:tc>
+      </w:tr>
+      <w:tr>
+        <w:trPr>
+          <w:cantSplit/>
+        </w:trPr>
+        <w:tc>
+          <w:tcPr>
+            <w:tcW w:type="dxa" w:w="1800"/>
+            <w:tcMar>
+              <w:top w:w="80" w:type="dxa"/>
+              <w:start w:w="120" w:type="dxa"/>
+              <w:bottom w:w="80" w:type="dxa"/>
+              <w:end w:w="120" w:type="dxa"/>
+            </w:tcMar>
+            <w:vAlign w:val="center"/>
+          </w:tcPr>
+          <w:p>
+            <w:pPr>
+              <w:spacing w:after="0"/>
+            </w:pPr>
+            <w:r>
+              <w:rPr>
+                <w:rFonts w:ascii="Calibri" w:hAnsi="Calibri"/>
+                <w:b/>
+                <w:i w:val="0"/>
+                <w:color w:val="202124"/>
+                <w:sz w:val="19"/>
+              </w:rPr>
+              <w:t>Certainty (default: undecided)</w:t>
+            </w:r>
+          </w:p>
+        </w:tc>
+        <w:tc>
+          <w:tcPr>
+            <w:tcW w:type="dxa" w:w="7020"/>
+            <w:tcMar>
+              <w:top w:w="80" w:type="dxa"/>
+              <w:start w:w="120" w:type="dxa"/>
+              <w:bottom w:w="80" w:type="dxa"/>
+              <w:end w:w="120" w:type="dxa"/>
+            </w:tcMar>
+            <w:vAlign w:val="center"/>
+          </w:tcPr>
+          <w:p>
+            <w:pPr>
+              <w:spacing w:after="0"/>
+            </w:pPr>
+            <w:r>
+              <w:rPr>
+                <w:rFonts w:ascii="Calibri" w:hAnsi="Calibri"/>
+                <w:b w:val="0"/>
+                <w:i w:val="0"/>
+                <w:color w:val="202124"/>
+                <w:sz w:val="19"/>
+              </w:rPr>
+              <w:t>undecided, wondering, doubtful, suspicious, wavering, conflicted, testing, cautiously considering, reluctantly convinced, settling, dawning realization, certain, adamant, entrenched, bullheaded</w:t>
+            </w:r>
+          </w:p>
+        </w:tc>
+        <w:tc>
+          <w:tcPr>
+            <w:tcW w:type="dxa" w:w="540"/>
+            <w:tcMar>
+              <w:top w:w="80" w:type="dxa"/>
+              <w:start w:w="120" w:type="dxa"/>
+              <w:bottom w:w="80" w:type="dxa"/>
+              <w:end w:w="120" w:type="dxa"/>
+            </w:tcMar>
+            <w:vAlign w:val="center"/>
+          </w:tcPr>
+          <w:p>
+            <w:pPr>
+              <w:spacing w:after="0"/>
+              <w:jc w:val="center"/>
+            </w:pPr>
+            <w:r>
+              <w:rPr>
+                <w:rFonts w:ascii="Calibri" w:hAnsi="Calibri"/>
+                <w:b/>
+                <w:i w:val="0"/>
+                <w:color w:val="657078"/>
+                <w:sz w:val="19"/>
+              </w:rPr>
+              <w:t>15</w:t>
+            </w:r>
+          </w:p>
+        </w:tc>
+      </w:tr>
+      <w:tr>
+        <w:trPr>
+          <w:cantSplit/>
+        </w:trPr>
+        <w:tc>
+          <w:tcPr>
+            <w:tcW w:type="dxa" w:w="1800"/>
+            <w:tcMar>
+              <w:top w:w="80" w:type="dxa"/>
+              <w:start w:w="120" w:type="dxa"/>
+              <w:bottom w:w="80" w:type="dxa"/>
+              <w:end w:w="120" w:type="dxa"/>
+            </w:tcMar>
+            <w:vAlign w:val="center"/>
+          </w:tcPr>
+          <w:p>
+            <w:pPr>
+              <w:spacing w:after="0"/>
+            </w:pPr>
+            <w:r>
+              <w:rPr>
+                <w:rFonts w:ascii="Calibri" w:hAnsi="Calibri"/>
+                <w:b/>
+                <w:i w:val="0"/>
+                <w:color w:val="202124"/>
+                <w:sz w:val="19"/>
+              </w:rPr>
+              <w:t>Engagement (default: observing)</w:t>
+            </w:r>
+          </w:p>
+        </w:tc>
+        <w:tc>
+          <w:tcPr>
+            <w:tcW w:type="dxa" w:w="7020"/>
+            <w:tcMar>
+              <w:top w:w="80" w:type="dxa"/>
+              <w:start w:w="120" w:type="dxa"/>
+              <w:bottom w:w="80" w:type="dxa"/>
+              <w:end w:w="120" w:type="dxa"/>
+            </w:tcMar>
+            <w:vAlign w:val="center"/>
+          </w:tcPr>
+          <w:p>
+            <w:pPr>
+              <w:spacing w:after="0"/>
+            </w:pPr>
+            <w:r>
+              <w:rPr>
+                <w:rFonts w:ascii="Calibri" w:hAnsi="Calibri"/>
+                <w:b w:val="0"/>
+                <w:i w:val="0"/>
+                <w:color w:val="202124"/>
+                <w:sz w:val="19"/>
+              </w:rPr>
+              <w:t>disengaged, checked out, withdrawn, distant, observing, monitoring, cautiously attentive, considering, curious, attentive, absorbed, compelled, fully engaged</w:t>
+            </w:r>
+          </w:p>
+        </w:tc>
+        <w:tc>
+          <w:tcPr>
+            <w:tcW w:type="dxa" w:w="540"/>
+            <w:tcMar>
+              <w:top w:w="80" w:type="dxa"/>
+              <w:start w:w="120" w:type="dxa"/>
+              <w:bottom w:w="80" w:type="dxa"/>
+              <w:end w:w="120" w:type="dxa"/>
+            </w:tcMar>
+            <w:vAlign w:val="center"/>
+          </w:tcPr>
+          <w:p>
+            <w:pPr>
+              <w:spacing w:after="0"/>
+              <w:jc w:val="center"/>
+            </w:pPr>
+            <w:r>
+              <w:rPr>
+                <w:rFonts w:ascii="Calibri" w:hAnsi="Calibri"/>
+                <w:b/>
+                <w:i w:val="0"/>
+                <w:color w:val="657078"/>
+                <w:sz w:val="19"/>
+              </w:rPr>
+              <w:t>13</w:t>
+            </w:r>
+          </w:p>
+        </w:tc>
+      </w:tr>
+      <w:tr>
+        <w:trPr>
+          <w:cantSplit/>
+        </w:trPr>
+        <w:tc>
+          <w:tcPr>
+            <w:tcW w:type="dxa" w:w="1800"/>
+            <w:tcMar>
+              <w:top w:w="80" w:type="dxa"/>
+              <w:start w:w="120" w:type="dxa"/>
+              <w:bottom w:w="80" w:type="dxa"/>
+              <w:end w:w="120" w:type="dxa"/>
+            </w:tcMar>
+            <w:vAlign w:val="center"/>
+          </w:tcPr>
+          <w:p>
+            <w:pPr>
+              <w:spacing w:after="0"/>
+            </w:pPr>
+            <w:r>
+              <w:rPr>
+                <w:rFonts w:ascii="Calibri" w:hAnsi="Calibri"/>
+                <w:b/>
+                <w:i w:val="0"/>
+                <w:color w:val="202124"/>
+                <w:sz w:val="19"/>
+              </w:rPr>
+              <w:t>Openness (default: cautious)</w:t>
+            </w:r>
+          </w:p>
+        </w:tc>
+        <w:tc>
+          <w:tcPr>
+            <w:tcW w:type="dxa" w:w="7020"/>
+            <w:tcMar>
+              <w:top w:w="80" w:type="dxa"/>
+              <w:start w:w="120" w:type="dxa"/>
+              <w:bottom w:w="80" w:type="dxa"/>
+              <w:end w:w="120" w:type="dxa"/>
+            </w:tcMar>
+            <w:vAlign w:val="center"/>
+          </w:tcPr>
+          <w:p>
+            <w:pPr>
+              <w:spacing w:after="0"/>
+            </w:pPr>
+            <w:r>
+              <w:rPr>
+                <w:rFonts w:ascii="Calibri" w:hAnsi="Calibri"/>
+                <w:b w:val="0"/>
+                <w:i w:val="0"/>
+                <w:color w:val="202124"/>
+                <w:sz w:val="19"/>
+              </w:rPr>
+              <w:t>sealed off, guarded, cautious, withholding, reserved, ambivalent, tentative, receptive, softening, vulnerable, inviting</w:t>
+            </w:r>
+          </w:p>
+        </w:tc>
+        <w:tc>
+          <w:tcPr>
+            <w:tcW w:type="dxa" w:w="540"/>
+            <w:tcMar>
+              <w:top w:w="80" w:type="dxa"/>
+              <w:start w:w="120" w:type="dxa"/>
+              <w:bottom w:w="80" w:type="dxa"/>
+              <w:end w:w="120" w:type="dxa"/>
+            </w:tcMar>
+            <w:vAlign w:val="center"/>
+          </w:tcPr>
+          <w:p>
+            <w:pPr>
+              <w:spacing w:after="0"/>
+              <w:jc w:val="center"/>
+            </w:pPr>
+            <w:r>
+              <w:rPr>
+                <w:rFonts w:ascii="Calibri" w:hAnsi="Calibri"/>
+                <w:b/>
+                <w:i w:val="0"/>
+                <w:color w:val="657078"/>
+                <w:sz w:val="19"/>
+              </w:rPr>
+              <w:t>11</w:t>
+            </w:r>
+          </w:p>
+        </w:tc>
+      </w:tr>
+      <w:tr>
+        <w:trPr>
+          <w:cantSplit/>
+        </w:trPr>
+        <w:tc>
+          <w:tcPr>
+            <w:tcW w:type="dxa" w:w="1800"/>
+            <w:tcMar>
+              <w:top w:w="80" w:type="dxa"/>
+              <w:start w:w="120" w:type="dxa"/>
+              <w:bottom w:w="80" w:type="dxa"/>
+              <w:end w:w="120" w:type="dxa"/>
+            </w:tcMar>
+            <w:vAlign w:val="center"/>
+          </w:tcPr>
+          <w:p>
+            <w:pPr>
+              <w:spacing w:after="0"/>
+            </w:pPr>
+            <w:r>
+              <w:rPr>
+                <w:rFonts w:ascii="Calibri" w:hAnsi="Calibri"/>
+                <w:b/>
+                <w:i w:val="0"/>
+                <w:color w:val="202124"/>
+                <w:sz w:val="19"/>
+              </w:rPr>
+              <w:t>Social orientation (default: monitoring others)</w:t>
+            </w:r>
+          </w:p>
+        </w:tc>
+        <w:tc>
+          <w:tcPr>
+            <w:tcW w:type="dxa" w:w="7020"/>
+            <w:tcMar>
+              <w:top w:w="80" w:type="dxa"/>
+              <w:start w:w="120" w:type="dxa"/>
+              <w:bottom w:w="80" w:type="dxa"/>
+              <w:end w:w="120" w:type="dxa"/>
+            </w:tcMar>
+            <w:vAlign w:val="center"/>
+          </w:tcPr>
+          <w:p>
+            <w:pPr>
+              <w:spacing w:after="0"/>
+            </w:pPr>
+            <w:r>
+              <w:rPr>
+                <w:rFonts w:ascii="Calibri" w:hAnsi="Calibri"/>
+                <w:b w:val="0"/>
+                <w:i w:val="0"/>
+                <w:color w:val="202124"/>
+                <w:sz w:val="19"/>
+              </w:rPr>
+              <w:t>self-protective, inward-focused, private processing, guarded contact, monitoring others, seeking safety, testing connection, seeking approval, receptive, affiliative, offering support, other-directed, group-oriented</w:t>
+            </w:r>
+          </w:p>
+        </w:tc>
+        <w:tc>
+          <w:tcPr>
+            <w:tcW w:type="dxa" w:w="540"/>
+            <w:tcMar>
+              <w:top w:w="80" w:type="dxa"/>
+              <w:start w:w="120" w:type="dxa"/>
+              <w:bottom w:w="80" w:type="dxa"/>
+              <w:end w:w="120" w:type="dxa"/>
+            </w:tcMar>
+            <w:vAlign w:val="center"/>
+          </w:tcPr>
+          <w:p>
+            <w:pPr>
+              <w:spacing w:after="0"/>
+              <w:jc w:val="center"/>
+            </w:pPr>
+            <w:r>
+              <w:rPr>
+                <w:rFonts w:ascii="Calibri" w:hAnsi="Calibri"/>
+                <w:b/>
+                <w:i w:val="0"/>
+                <w:color w:val="657078"/>
+                <w:sz w:val="19"/>
+              </w:rPr>
+              <w:t>13</w:t>
+            </w:r>
+          </w:p>
+        </w:tc>
+      </w:tr>
+    </w:tbl>
+    <w:p>
+      <w:pPr>
+        <w:spacing w:after="0"/>
+      </w:pPr>
+    </w:p>
+    <w:p>
+      <w:pPr>
+        <w:pStyle w:val="Heading1"/>
+        <w:keepNext/>
+      </w:pPr>
+      <w:r>
+        <w:t>4. Vocabulary Assignment Taxonomy</w:t>
       </w:r>
     </w:p>
     <w:p>
@@ -5979,7 +6687,7 @@
         <w:keepNext/>
       </w:pPr>
       <w:r>
-        <w:t>4. Assignment Bins and Interpretation Fields</w:t>
+        <w:t>5. Assignment Bins and Interpretation Fields</w:t>
       </w:r>
     </w:p>
     <w:p>
@@ -6410,7 +7118,7 @@
         <w:keepNext/>
       </w:pPr>
       <w:r>
-        <w:t>5. Workflow Modules</w:t>
+        <w:t>6. Workflow Modules</w:t>
       </w:r>
     </w:p>
     <w:tbl>
@@ -7051,7 +7759,7 @@
         <w:keepNext/>
       </w:pPr>
       <w:r>
-        <w:t>6. Literature Backbone Notes</w:t>
+        <w:t>7. Literature Backbone Notes</w:t>
       </w:r>
     </w:p>
     <w:p>

</xml_diff>

<commit_message>
Expand facial and social taxonomy terms
</commit_message>
<xml_diff>
--- a/docs/Dimensions_of_Expression_Taxonomy.docx
+++ b/docs/Dimensions_of_Expression_Taxonomy.docx
@@ -242,7 +242,7 @@
                 <w:color w:val="246A73"/>
                 <w:sz w:val="32"/>
               </w:rPr>
-              <w:t>323</w:t>
+              <w:t>324</w:t>
             </w:r>
           </w:p>
         </w:tc>
@@ -271,7 +271,7 @@
                 <w:color w:val="246A73"/>
                 <w:sz w:val="32"/>
               </w:rPr>
-              <w:t>105</w:t>
+              <w:t>108</w:t>
             </w:r>
           </w:p>
         </w:tc>
@@ -358,7 +358,7 @@
                 <w:color w:val="246A73"/>
                 <w:sz w:val="32"/>
               </w:rPr>
-              <w:t>496</w:t>
+              <w:t>500</w:t>
             </w:r>
           </w:p>
         </w:tc>
@@ -1006,7 +1006,7 @@
                 <w:color w:val="202124"/>
                 <w:sz w:val="19"/>
               </w:rPr>
-              <w:t>furrowed, knitted, pinched, raised inner brows, arched, skeptical, pleading, alarmed, brooding, compressed, tilted, softened, asymmetrical, drawn together, lifted in worry</w:t>
+              <w:t>furrowed, knitted, pinched, raised inner brows, raised in delight, raised in surprise, arched, skeptical, pleading, alarmed, brooding, compressed, tilted, softened, asymmetrical, drawn together, lifted in worry</w:t>
             </w:r>
           </w:p>
         </w:tc>
@@ -1034,7 +1034,7 @@
                 <w:color w:val="657078"/>
                 <w:sz w:val="19"/>
               </w:rPr>
-              <w:t>15</w:t>
+              <w:t>17</w:t>
             </w:r>
           </w:p>
         </w:tc>
@@ -1441,7 +1441,7 @@
                 <w:color w:val="202124"/>
                 <w:sz w:val="19"/>
               </w:rPr>
-              <w:t>lifted cheeks, flushed, tight cheeks, slack cheeks, wrinkled nose, softened cheeks, strained nasolabial fold, tearful fullness, smiling cheeks, suppressed disgust, compressed midface, warmed, drained, tense nostrils, micro-flinch</w:t>
+              <w:t>lifted cheeks, flushed, tight cheeks, slack cheeks, wrinkled nose, softened cheeks, strained nasolabial fold, tearful fullness, smiling cheeks, suppressed disgust, compressed midface, warmed, drained, tense nostrils, flared nostrils, micro-flinch</w:t>
             </w:r>
           </w:p>
         </w:tc>
@@ -1469,7 +1469,7 @@
                 <w:color w:val="657078"/>
                 <w:sz w:val="19"/>
               </w:rPr>
-              <w:t>15</w:t>
+              <w:t>16</w:t>
             </w:r>
           </w:p>
         </w:tc>
@@ -6555,7 +6555,7 @@
                 <w:color w:val="202124"/>
                 <w:sz w:val="19"/>
               </w:rPr>
-              <w:t>inviting, appeasing, reassuring, withholding, defensive, challenging, protective, submissive, commanding, pleading</w:t>
+              <w:t>inviting, appeasing, reassuring, compromising, withholding, defensive, challenging, protective, submissive, commanding, pleading</w:t>
             </w:r>
           </w:p>
         </w:tc>
@@ -6583,7 +6583,7 @@
                 <w:color w:val="657078"/>
                 <w:sz w:val="19"/>
               </w:rPr>
-              <w:t>10</w:t>
+              <w:t>11</w:t>
             </w:r>
           </w:p>
         </w:tc>

</xml_diff>

<commit_message>
Expand taxonomy and rebalance dashboard
</commit_message>
<xml_diff>
--- a/docs/Dimensions_of_Expression_Taxonomy.docx
+++ b/docs/Dimensions_of_Expression_Taxonomy.docx
@@ -242,7 +242,7 @@
                 <w:color w:val="246A73"/>
                 <w:sz w:val="32"/>
               </w:rPr>
-              <w:t>324</w:t>
+              <w:t>434</w:t>
             </w:r>
           </w:p>
         </w:tc>
@@ -358,7 +358,7 @@
                 <w:color w:val="246A73"/>
                 <w:sz w:val="32"/>
               </w:rPr>
-              <w:t>500</w:t>
+              <w:t>593</w:t>
             </w:r>
           </w:p>
         </w:tc>
@@ -4446,6 +4446,93 @@
           </w:p>
         </w:tc>
       </w:tr>
+      <w:tr>
+        <w:trPr>
+          <w:cantSplit/>
+        </w:trPr>
+        <w:tc>
+          <w:tcPr>
+            <w:tcW w:type="dxa" w:w="1800"/>
+            <w:tcMar>
+              <w:top w:w="80" w:type="dxa"/>
+              <w:start w:w="120" w:type="dxa"/>
+              <w:bottom w:w="80" w:type="dxa"/>
+              <w:end w:w="120" w:type="dxa"/>
+            </w:tcMar>
+            <w:vAlign w:val="center"/>
+          </w:tcPr>
+          <w:p>
+            <w:pPr>
+              <w:spacing w:after="0"/>
+            </w:pPr>
+            <w:r>
+              <w:rPr>
+                <w:rFonts w:ascii="Calibri" w:hAnsi="Calibri"/>
+                <w:b/>
+                <w:i w:val="0"/>
+                <w:color w:val="202124"/>
+                <w:sz w:val="19"/>
+              </w:rPr>
+              <w:t>Care</w:t>
+            </w:r>
+          </w:p>
+        </w:tc>
+        <w:tc>
+          <w:tcPr>
+            <w:tcW w:type="dxa" w:w="7020"/>
+            <w:tcMar>
+              <w:top w:w="80" w:type="dxa"/>
+              <w:start w:w="120" w:type="dxa"/>
+              <w:bottom w:w="80" w:type="dxa"/>
+              <w:end w:w="120" w:type="dxa"/>
+            </w:tcMar>
+            <w:vAlign w:val="center"/>
+          </w:tcPr>
+          <w:p>
+            <w:pPr>
+              <w:spacing w:after="0"/>
+            </w:pPr>
+            <w:r>
+              <w:rPr>
+                <w:rFonts w:ascii="Calibri" w:hAnsi="Calibri"/>
+                <w:b w:val="0"/>
+                <w:i w:val="0"/>
+                <w:color w:val="202124"/>
+                <w:sz w:val="19"/>
+              </w:rPr>
+              <w:t>compassionate, tender, protective, affectionate, attuned, nurturing, devoted, forgiving, grateful, longing, concerned, mournful care, loyal, gentle, emotionally present</w:t>
+            </w:r>
+          </w:p>
+        </w:tc>
+        <w:tc>
+          <w:tcPr>
+            <w:tcW w:type="dxa" w:w="540"/>
+            <w:tcMar>
+              <w:top w:w="80" w:type="dxa"/>
+              <w:start w:w="120" w:type="dxa"/>
+              <w:bottom w:w="80" w:type="dxa"/>
+              <w:end w:w="120" w:type="dxa"/>
+            </w:tcMar>
+            <w:vAlign w:val="center"/>
+          </w:tcPr>
+          <w:p>
+            <w:pPr>
+              <w:spacing w:after="0"/>
+              <w:jc w:val="center"/>
+            </w:pPr>
+            <w:r>
+              <w:rPr>
+                <w:rFonts w:ascii="Calibri" w:hAnsi="Calibri"/>
+                <w:b/>
+                <w:i w:val="0"/>
+                <w:color w:val="657078"/>
+                <w:sz w:val="19"/>
+              </w:rPr>
+              <w:t>15</w:t>
+            </w:r>
+          </w:p>
+        </w:tc>
+      </w:tr>
     </w:tbl>
     <w:p>
       <w:pPr>
@@ -4644,7 +4731,7 @@
                 <w:color w:val="202124"/>
                 <w:sz w:val="19"/>
               </w:rPr>
-              <w:t>poised, composed, collected, steady, self-possessed, controlled, formal, gracious, contained, polished, serene, unruffled, measured, resolved, dignified</w:t>
+              <w:t>poised, composed, collected, steady, self-possessed, controlled, formal, gracious, contained, polished, serene, unruffled, measured, resolved, dignified, brittle, diplomatic, professional, self-monitoring, ceremonious, stoic, deliberate, restrained, watchful, quietly resolute</w:t>
             </w:r>
           </w:p>
         </w:tc>
@@ -4672,7 +4759,7 @@
                 <w:color w:val="657078"/>
                 <w:sz w:val="19"/>
               </w:rPr>
-              <w:t>15</w:t>
+              <w:t>25</w:t>
             </w:r>
           </w:p>
         </w:tc>
@@ -4731,7 +4818,7 @@
                 <w:color w:val="202124"/>
                 <w:sz w:val="19"/>
               </w:rPr>
-              <w:t>harried, frazzled, rattled, flustered, frantic, keyed up, strained, overextended, restless, jittery, panicked, pressured, rushed, scattered, overloaded, frayed</w:t>
+              <w:t>harried, frazzled, rattled, flustered, frantic, keyed up, strained, overextended, restless, jittery, panicked, pressured, rushed, scattered, overloaded, frayed, bristling, twitchy, breathless, short-fused, shakily contained, overclocked, simmering, fraying, vibrating with tension</w:t>
             </w:r>
           </w:p>
         </w:tc>
@@ -4759,7 +4846,7 @@
                 <w:color w:val="657078"/>
                 <w:sz w:val="19"/>
               </w:rPr>
-              <w:t>16</w:t>
+              <w:t>25</w:t>
             </w:r>
           </w:p>
         </w:tc>
@@ -4818,7 +4905,7 @@
                 <w:color w:val="202124"/>
                 <w:sz w:val="19"/>
               </w:rPr>
-              <w:t>paranoid, spooked, jittery, absent-minded, lost in thought, haunted, dissociated, unsettled, skittish, overstimulated, disoriented, on edge, checked out, preoccupied, ungrounded</w:t>
+              <w:t>paranoid, spooked, jittery, absent-minded, lost in thought, haunted, dissociated, unsettled, skittish, overstimulated, disoriented, on edge, checked out, preoccupied, ungrounded, flooded, spiraling, shut down, numbed, scrambled, emotionally overloaded, dissociating, unmoored, stunned, unable to organize thought</w:t>
             </w:r>
           </w:p>
         </w:tc>
@@ -4846,7 +4933,7 @@
                 <w:color w:val="657078"/>
                 <w:sz w:val="19"/>
               </w:rPr>
-              <w:t>15</w:t>
+              <w:t>25</w:t>
             </w:r>
           </w:p>
         </w:tc>
@@ -4905,7 +4992,7 @@
                 <w:color w:val="202124"/>
                 <w:sz w:val="19"/>
               </w:rPr>
-              <w:t>slumped, upright, braced, collapsed, lifted, hunched, guarded, open, withdrawn, leaning in, leaning away, stiff, loose, rooted, unsteady</w:t>
+              <w:t>slumped, upright, braced, collapsed, lifted, hunched, guarded, open, withdrawn, leaning in, leaning away, stiff, loose, rooted, unsteady, recoiled, folded inward, squared up, half-turned, suspended, poised to move, shrinking, presenting, shielding, reaching, rooted in place, interrupted mid-motion</w:t>
             </w:r>
           </w:p>
         </w:tc>
@@ -4933,7 +5020,7 @@
                 <w:color w:val="657078"/>
                 <w:sz w:val="19"/>
               </w:rPr>
-              <w:t>15</w:t>
+              <w:t>27</w:t>
             </w:r>
           </w:p>
         </w:tc>
@@ -4992,7 +5079,7 @@
                 <w:color w:val="202124"/>
                 <w:sz w:val="19"/>
               </w:rPr>
-              <w:t>buoyant, drained, depleted, charged, alert, dulled, sleepy, wired, heavy, light, frozen, fluid, activated, subdued, sparked</w:t>
+              <w:t>buoyant, drained, depleted, charged, alert, dulled, sleepy, wired, heavy, light, frozen, fluid, activated, subdued, sparked, vigilant, spent, tremulous, gathered, low-burning, collapsing, reviving, suspended, heavy-limbed, sparking back to life</w:t>
             </w:r>
           </w:p>
         </w:tc>
@@ -5020,7 +5107,7 @@
                 <w:color w:val="657078"/>
                 <w:sz w:val="19"/>
               </w:rPr>
-              <w:t>15</w:t>
+              <w:t>25</w:t>
             </w:r>
           </w:p>
         </w:tc>
@@ -6179,6 +6266,267 @@
                 <w:sz w:val="19"/>
               </w:rPr>
               <w:t>8</w:t>
+            </w:r>
+          </w:p>
+        </w:tc>
+      </w:tr>
+      <w:tr>
+        <w:trPr>
+          <w:cantSplit/>
+        </w:trPr>
+        <w:tc>
+          <w:tcPr>
+            <w:tcW w:type="dxa" w:w="1800"/>
+            <w:tcMar>
+              <w:top w:w="80" w:type="dxa"/>
+              <w:start w:w="120" w:type="dxa"/>
+              <w:bottom w:w="80" w:type="dxa"/>
+              <w:end w:w="120" w:type="dxa"/>
+            </w:tcMar>
+            <w:vAlign w:val="center"/>
+          </w:tcPr>
+          <w:p>
+            <w:pPr>
+              <w:spacing w:after="0"/>
+            </w:pPr>
+            <w:r>
+              <w:rPr>
+                <w:rFonts w:ascii="Calibri" w:hAnsi="Calibri"/>
+                <w:b/>
+                <w:i w:val="0"/>
+                <w:color w:val="202124"/>
+                <w:sz w:val="19"/>
+              </w:rPr>
+              <w:t>Stakes</w:t>
+            </w:r>
+          </w:p>
+        </w:tc>
+        <w:tc>
+          <w:tcPr>
+            <w:tcW w:type="dxa" w:w="7020"/>
+            <w:tcMar>
+              <w:top w:w="80" w:type="dxa"/>
+              <w:start w:w="120" w:type="dxa"/>
+              <w:bottom w:w="80" w:type="dxa"/>
+              <w:end w:w="120" w:type="dxa"/>
+            </w:tcMar>
+            <w:vAlign w:val="center"/>
+          </w:tcPr>
+          <w:p>
+            <w:pPr>
+              <w:spacing w:after="0"/>
+            </w:pPr>
+            <w:r>
+              <w:rPr>
+                <w:rFonts w:ascii="Calibri" w:hAnsi="Calibri"/>
+                <w:b w:val="0"/>
+                <w:i w:val="0"/>
+                <w:color w:val="202124"/>
+                <w:sz w:val="19"/>
+              </w:rPr>
+              <w:t>trivial, inconvenience, consequential, escalating, contained, temporary, reparable, irreversible, preventable, inevitable, identity-shaping, relationship-altering, life-changing, sacred or value-laden</w:t>
+            </w:r>
+          </w:p>
+        </w:tc>
+        <w:tc>
+          <w:tcPr>
+            <w:tcW w:type="dxa" w:w="540"/>
+            <w:tcMar>
+              <w:top w:w="80" w:type="dxa"/>
+              <w:start w:w="120" w:type="dxa"/>
+              <w:bottom w:w="80" w:type="dxa"/>
+              <w:end w:w="120" w:type="dxa"/>
+            </w:tcMar>
+            <w:vAlign w:val="center"/>
+          </w:tcPr>
+          <w:p>
+            <w:pPr>
+              <w:spacing w:after="0"/>
+              <w:jc w:val="center"/>
+            </w:pPr>
+            <w:r>
+              <w:rPr>
+                <w:rFonts w:ascii="Calibri" w:hAnsi="Calibri"/>
+                <w:b/>
+                <w:i w:val="0"/>
+                <w:color w:val="657078"/>
+                <w:sz w:val="19"/>
+              </w:rPr>
+              <w:t>14</w:t>
+            </w:r>
+          </w:p>
+        </w:tc>
+      </w:tr>
+      <w:tr>
+        <w:trPr>
+          <w:cantSplit/>
+        </w:trPr>
+        <w:tc>
+          <w:tcPr>
+            <w:tcW w:type="dxa" w:w="1800"/>
+            <w:tcMar>
+              <w:top w:w="80" w:type="dxa"/>
+              <w:start w:w="120" w:type="dxa"/>
+              <w:bottom w:w="80" w:type="dxa"/>
+              <w:end w:w="120" w:type="dxa"/>
+            </w:tcMar>
+            <w:vAlign w:val="center"/>
+          </w:tcPr>
+          <w:p>
+            <w:pPr>
+              <w:spacing w:after="0"/>
+            </w:pPr>
+            <w:r>
+              <w:rPr>
+                <w:rFonts w:ascii="Calibri" w:hAnsi="Calibri"/>
+                <w:b/>
+                <w:i w:val="0"/>
+                <w:color w:val="202124"/>
+                <w:sz w:val="19"/>
+              </w:rPr>
+              <w:t>Moral assessment</w:t>
+            </w:r>
+          </w:p>
+        </w:tc>
+        <w:tc>
+          <w:tcPr>
+            <w:tcW w:type="dxa" w:w="7020"/>
+            <w:tcMar>
+              <w:top w:w="80" w:type="dxa"/>
+              <w:start w:w="120" w:type="dxa"/>
+              <w:bottom w:w="80" w:type="dxa"/>
+              <w:end w:w="120" w:type="dxa"/>
+            </w:tcMar>
+            <w:vAlign w:val="center"/>
+          </w:tcPr>
+          <w:p>
+            <w:pPr>
+              <w:spacing w:after="0"/>
+            </w:pPr>
+            <w:r>
+              <w:rPr>
+                <w:rFonts w:ascii="Calibri" w:hAnsi="Calibri"/>
+                <w:b w:val="0"/>
+                <w:i w:val="0"/>
+                <w:color w:val="202124"/>
+                <w:sz w:val="19"/>
+              </w:rPr>
+              <w:t>fair, unfair, deserved, undeserved, compassionate, cruel, violating, honorable, shameful, innocent, boundary crossed, promise broken, obligation unmet, mercy received, responsibility claimed</w:t>
+            </w:r>
+          </w:p>
+        </w:tc>
+        <w:tc>
+          <w:tcPr>
+            <w:tcW w:type="dxa" w:w="540"/>
+            <w:tcMar>
+              <w:top w:w="80" w:type="dxa"/>
+              <w:start w:w="120" w:type="dxa"/>
+              <w:bottom w:w="80" w:type="dxa"/>
+              <w:end w:w="120" w:type="dxa"/>
+            </w:tcMar>
+            <w:vAlign w:val="center"/>
+          </w:tcPr>
+          <w:p>
+            <w:pPr>
+              <w:spacing w:after="0"/>
+              <w:jc w:val="center"/>
+            </w:pPr>
+            <w:r>
+              <w:rPr>
+                <w:rFonts w:ascii="Calibri" w:hAnsi="Calibri"/>
+                <w:b/>
+                <w:i w:val="0"/>
+                <w:color w:val="657078"/>
+                <w:sz w:val="19"/>
+              </w:rPr>
+              <w:t>15</w:t>
+            </w:r>
+          </w:p>
+        </w:tc>
+      </w:tr>
+      <w:tr>
+        <w:trPr>
+          <w:cantSplit/>
+        </w:trPr>
+        <w:tc>
+          <w:tcPr>
+            <w:tcW w:type="dxa" w:w="1800"/>
+            <w:tcMar>
+              <w:top w:w="80" w:type="dxa"/>
+              <w:start w:w="120" w:type="dxa"/>
+              <w:bottom w:w="80" w:type="dxa"/>
+              <w:end w:w="120" w:type="dxa"/>
+            </w:tcMar>
+            <w:vAlign w:val="center"/>
+          </w:tcPr>
+          <w:p>
+            <w:pPr>
+              <w:spacing w:after="0"/>
+            </w:pPr>
+            <w:r>
+              <w:rPr>
+                <w:rFonts w:ascii="Calibri" w:hAnsi="Calibri"/>
+                <w:b/>
+                <w:i w:val="0"/>
+                <w:color w:val="202124"/>
+                <w:sz w:val="19"/>
+              </w:rPr>
+              <w:t>Relational meaning</w:t>
+            </w:r>
+          </w:p>
+        </w:tc>
+        <w:tc>
+          <w:tcPr>
+            <w:tcW w:type="dxa" w:w="7020"/>
+            <w:tcMar>
+              <w:top w:w="80" w:type="dxa"/>
+              <w:start w:w="120" w:type="dxa"/>
+              <w:bottom w:w="80" w:type="dxa"/>
+              <w:end w:w="120" w:type="dxa"/>
+            </w:tcMar>
+            <w:vAlign w:val="center"/>
+          </w:tcPr>
+          <w:p>
+            <w:pPr>
+              <w:spacing w:after="0"/>
+            </w:pPr>
+            <w:r>
+              <w:rPr>
+                <w:rFonts w:ascii="Calibri" w:hAnsi="Calibri"/>
+                <w:b w:val="0"/>
+                <w:i w:val="0"/>
+                <w:color w:val="202124"/>
+                <w:sz w:val="19"/>
+              </w:rPr>
+              <w:t>safe, unsafe, trusted, betrayed, seen, misunderstood, believed, dismissed, welcomed, excluded, protected, abandoned, forgiven, accountable, emotionally held</w:t>
+            </w:r>
+          </w:p>
+        </w:tc>
+        <w:tc>
+          <w:tcPr>
+            <w:tcW w:type="dxa" w:w="540"/>
+            <w:tcMar>
+              <w:top w:w="80" w:type="dxa"/>
+              <w:start w:w="120" w:type="dxa"/>
+              <w:bottom w:w="80" w:type="dxa"/>
+              <w:end w:w="120" w:type="dxa"/>
+            </w:tcMar>
+            <w:vAlign w:val="center"/>
+          </w:tcPr>
+          <w:p>
+            <w:pPr>
+              <w:spacing w:after="0"/>
+              <w:jc w:val="center"/>
+            </w:pPr>
+            <w:r>
+              <w:rPr>
+                <w:rFonts w:ascii="Calibri" w:hAnsi="Calibri"/>
+                <w:b/>
+                <w:i w:val="0"/>
+                <w:color w:val="657078"/>
+                <w:sz w:val="19"/>
+              </w:rPr>
+              <w:t>15</w:t>
             </w:r>
           </w:p>
         </w:tc>

</xml_diff>

<commit_message>
Protect pending tags and expand relational vocabulary
</commit_message>
<xml_diff>
--- a/docs/Dimensions_of_Expression_Taxonomy.docx
+++ b/docs/Dimensions_of_Expression_Taxonomy.docx
@@ -242,7 +242,7 @@
                 <w:color w:val="246A73"/>
                 <w:sz w:val="32"/>
               </w:rPr>
-              <w:t>434</w:t>
+              <w:t>439</w:t>
             </w:r>
           </w:p>
         </w:tc>
@@ -358,7 +358,7 @@
                 <w:color w:val="246A73"/>
                 <w:sz w:val="32"/>
               </w:rPr>
-              <w:t>593</w:t>
+              <w:t>598</w:t>
             </w:r>
           </w:p>
         </w:tc>
@@ -6903,7 +6903,7 @@
                 <w:color w:val="202124"/>
                 <w:sz w:val="19"/>
               </w:rPr>
-              <w:t>inviting, appeasing, reassuring, compromising, withholding, defensive, challenging, protective, submissive, commanding, pleading</w:t>
+              <w:t>inviting, appeasing, reassuring, compromising, contrite, deferential, reverent, sorry, apologetic, withholding, defensive, challenging, protective, submissive, commanding, pleading</w:t>
             </w:r>
           </w:p>
         </w:tc>
@@ -6931,7 +6931,7 @@
                 <w:color w:val="657078"/>
                 <w:sz w:val="19"/>
               </w:rPr>
-              <w:t>11</w:t>
+              <w:t>16</w:t>
             </w:r>
           </w:p>
         </w:tc>

</xml_diff>

<commit_message>
Add wistful yearning and forlorn terms
</commit_message>
<xml_diff>
--- a/docs/Dimensions_of_Expression_Taxonomy.docx
+++ b/docs/Dimensions_of_Expression_Taxonomy.docx
@@ -242,7 +242,7 @@
                 <w:color w:val="246A73"/>
                 <w:sz w:val="32"/>
               </w:rPr>
-              <w:t>439</w:t>
+              <w:t>442</w:t>
             </w:r>
           </w:p>
         </w:tc>
@@ -300,7 +300,7 @@
                 <w:color w:val="246A73"/>
                 <w:sz w:val="32"/>
               </w:rPr>
-              <w:t>89</w:t>
+              <w:t>92</w:t>
             </w:r>
           </w:p>
         </w:tc>
@@ -358,7 +358,7 @@
                 <w:color w:val="246A73"/>
                 <w:sz w:val="32"/>
               </w:rPr>
-              <w:t>598</w:t>
+              <w:t>601</w:t>
             </w:r>
           </w:p>
         </w:tc>
@@ -1829,7 +1829,7 @@
                 <w:color w:val="202124"/>
                 <w:sz w:val="19"/>
               </w:rPr>
-              <w:t>Sad, Suffering, Agony, Hurt, Depressed, Sorrow, Disappointed, Dismayed, Displeased, Shameful, Regretful, Guilty, Neglected, Isolated, Lonely, Despair, Grief, Powerless</w:t>
+              <w:t>Sad, Suffering, Agony, Hurt, Depressed, Sorrow, Disappointed, Dismayed, Displeased, Shameful, Regretful, Guilty, Neglected, Isolated, Lonely, Despair, Grief, Powerless, Wistful, Yearning, Forlorn</w:t>
             </w:r>
           </w:p>
         </w:tc>
@@ -1857,7 +1857,7 @@
                 <w:color w:val="657078"/>
                 <w:sz w:val="19"/>
               </w:rPr>
-              <w:t>18</w:t>
+              <w:t>21</w:t>
             </w:r>
           </w:p>
         </w:tc>
@@ -3978,7 +3978,7 @@
                 <w:color w:val="202124"/>
                 <w:sz w:val="19"/>
               </w:rPr>
-              <w:t>lonely, isolated, abandoned, vulnerable, victimized, fragile, despair, grief, powerless, guilty, ashamed, remorseful, depressed, empty, inferior, hurt, disappointed, embarrassed</w:t>
+              <w:t>lonely, isolated, abandoned, vulnerable, victimized, fragile, despair, grief, powerless, guilty, ashamed, remorseful, depressed, empty, inferior, hurt, disappointed, embarrassed, wistful, yearning, forlorn</w:t>
             </w:r>
           </w:p>
         </w:tc>
@@ -4006,7 +4006,7 @@
                 <w:color w:val="657078"/>
                 <w:sz w:val="19"/>
               </w:rPr>
-              <w:t>18</w:t>
+              <w:t>21</w:t>
             </w:r>
           </w:p>
         </w:tc>
@@ -7600,93 +7600,6 @@
                 <w:color w:val="202124"/>
                 <w:sz w:val="19"/>
               </w:rPr>
-              <w:t>Image</w:t>
-            </w:r>
-          </w:p>
-        </w:tc>
-        <w:tc>
-          <w:tcPr>
-            <w:tcW w:type="dxa" w:w="6220"/>
-            <w:tcMar>
-              <w:top w:w="80" w:type="dxa"/>
-              <w:start w:w="120" w:type="dxa"/>
-              <w:bottom w:w="80" w:type="dxa"/>
-              <w:end w:w="120" w:type="dxa"/>
-            </w:tcMar>
-            <w:vAlign w:val="center"/>
-          </w:tcPr>
-          <w:p>
-            <w:pPr>
-              <w:spacing w:after="0"/>
-            </w:pPr>
-            <w:r>
-              <w:rPr>
-                <w:rFonts w:ascii="Calibri" w:hAnsi="Calibri"/>
-                <w:b w:val="0"/>
-                <w:i w:val="0"/>
-                <w:color w:val="202124"/>
-                <w:sz w:val="19"/>
-              </w:rPr>
-              <w:t>image</w:t>
-            </w:r>
-          </w:p>
-        </w:tc>
-        <w:tc>
-          <w:tcPr>
-            <w:tcW w:type="dxa" w:w="540"/>
-            <w:tcMar>
-              <w:top w:w="80" w:type="dxa"/>
-              <w:start w:w="120" w:type="dxa"/>
-              <w:bottom w:w="80" w:type="dxa"/>
-              <w:end w:w="120" w:type="dxa"/>
-            </w:tcMar>
-            <w:vAlign w:val="center"/>
-          </w:tcPr>
-          <w:p>
-            <w:pPr>
-              <w:spacing w:after="0"/>
-              <w:jc w:val="center"/>
-            </w:pPr>
-            <w:r>
-              <w:rPr>
-                <w:rFonts w:ascii="Calibri" w:hAnsi="Calibri"/>
-                <w:b/>
-                <w:i w:val="0"/>
-                <w:color w:val="657078"/>
-                <w:sz w:val="19"/>
-              </w:rPr>
-              <w:t>1</w:t>
-            </w:r>
-          </w:p>
-        </w:tc>
-      </w:tr>
-      <w:tr>
-        <w:trPr>
-          <w:cantSplit/>
-        </w:trPr>
-        <w:tc>
-          <w:tcPr>
-            <w:tcW w:type="dxa" w:w="2600"/>
-            <w:tcMar>
-              <w:top w:w="80" w:type="dxa"/>
-              <w:start w:w="120" w:type="dxa"/>
-              <w:bottom w:w="80" w:type="dxa"/>
-              <w:end w:w="120" w:type="dxa"/>
-            </w:tcMar>
-            <w:vAlign w:val="center"/>
-          </w:tcPr>
-          <w:p>
-            <w:pPr>
-              <w:spacing w:after="0"/>
-            </w:pPr>
-            <w:r>
-              <w:rPr>
-                <w:rFonts w:ascii="Calibri" w:hAnsi="Calibri"/>
-                <w:b/>
-                <w:i w:val="0"/>
-                <w:color w:val="202124"/>
-                <w:sz w:val="19"/>
-              </w:rPr>
               <w:t>Vocabulary</w:t>
             </w:r>
           </w:p>
@@ -7976,93 +7889,6 @@
                 <w:sz w:val="19"/>
               </w:rPr>
               <w:t>interpret</w:t>
-            </w:r>
-          </w:p>
-        </w:tc>
-        <w:tc>
-          <w:tcPr>
-            <w:tcW w:type="dxa" w:w="540"/>
-            <w:tcMar>
-              <w:top w:w="80" w:type="dxa"/>
-              <w:start w:w="120" w:type="dxa"/>
-              <w:bottom w:w="80" w:type="dxa"/>
-              <w:end w:w="120" w:type="dxa"/>
-            </w:tcMar>
-            <w:vAlign w:val="center"/>
-          </w:tcPr>
-          <w:p>
-            <w:pPr>
-              <w:spacing w:after="0"/>
-              <w:jc w:val="center"/>
-            </w:pPr>
-            <w:r>
-              <w:rPr>
-                <w:rFonts w:ascii="Calibri" w:hAnsi="Calibri"/>
-                <w:b/>
-                <w:i w:val="0"/>
-                <w:color w:val="657078"/>
-                <w:sz w:val="19"/>
-              </w:rPr>
-              <w:t>1</w:t>
-            </w:r>
-          </w:p>
-        </w:tc>
-      </w:tr>
-      <w:tr>
-        <w:trPr>
-          <w:cantSplit/>
-        </w:trPr>
-        <w:tc>
-          <w:tcPr>
-            <w:tcW w:type="dxa" w:w="2600"/>
-            <w:tcMar>
-              <w:top w:w="80" w:type="dxa"/>
-              <w:start w:w="120" w:type="dxa"/>
-              <w:bottom w:w="80" w:type="dxa"/>
-              <w:end w:w="120" w:type="dxa"/>
-            </w:tcMar>
-            <w:vAlign w:val="center"/>
-          </w:tcPr>
-          <w:p>
-            <w:pPr>
-              <w:spacing w:after="0"/>
-            </w:pPr>
-            <w:r>
-              <w:rPr>
-                <w:rFonts w:ascii="Calibri" w:hAnsi="Calibri"/>
-                <w:b/>
-                <w:i w:val="0"/>
-                <w:color w:val="202124"/>
-                <w:sz w:val="19"/>
-              </w:rPr>
-              <w:t>Compare</w:t>
-            </w:r>
-          </w:p>
-        </w:tc>
-        <w:tc>
-          <w:tcPr>
-            <w:tcW w:type="dxa" w:w="6220"/>
-            <w:tcMar>
-              <w:top w:w="80" w:type="dxa"/>
-              <w:start w:w="120" w:type="dxa"/>
-              <w:bottom w:w="80" w:type="dxa"/>
-              <w:end w:w="120" w:type="dxa"/>
-            </w:tcMar>
-            <w:vAlign w:val="center"/>
-          </w:tcPr>
-          <w:p>
-            <w:pPr>
-              <w:spacing w:after="0"/>
-            </w:pPr>
-            <w:r>
-              <w:rPr>
-                <w:rFonts w:ascii="Calibri" w:hAnsi="Calibri"/>
-                <w:b w:val="0"/>
-                <w:i w:val="0"/>
-                <w:color w:val="202124"/>
-                <w:sz w:val="19"/>
-              </w:rPr>
-              <w:t>compare</w:t>
             </w:r>
           </w:p>
         </w:tc>

</xml_diff>